<commit_message>
feat: Update resume documents to align with Azure project framing
- Added new sections to legacy resumes for Azure Data Factory, Synapse, Storage, and PySpark projects.
- Enhanced wording in resumes to improve clarity and reduce repetition regarding Azure technologies.
- Documented work done on Power BI cloud migration and configuration for Standard Bank and Coca-Cola.
- Implemented fixes for database connection issues and deployment script failures in the BlackFire Portal project.
- Improved backup and restore scripts for local MySQL databases, ensuring compatibility with various naming conventions.
</commit_message>
<xml_diff>
--- a/JS_Resume/Jubhele Shange CV.docx
+++ b/JS_Resume/Jubhele Shange CV.docx
@@ -94,12 +94,7 @@
         </w:rPr>
       </w:pPr>
       <w:r>
-        <w:rPr>
-          <w:rFonts w:ascii="Calibri" w:hAnsi="Calibri" w:cs="Calibri"/>
-          <w:color w:val="000000"/>
-          <w:sz w:val="20"/>
-        </w:rPr>
-        <w:t>High-impact Engineer with dual specialisation in data engineering and full-stack software development. Expert in enterprise data governance using Microsoft Purview, SQL-based data warehouse engineering, SAP financial data pipelines, and AML/compliance delivery. Proven across banking, insurance, investment, and security sectors — consistently translating complex business requirements into scalable, production-ready solutions.</w:t>
+        <w:t>Senior data engineer and consultant with 14+ years across BI, database delivery, and regulated enterprise environments. Specialises in Azure data platform delivery, data governance, and production support, with hands-on experience in Azure Data Factory, Azure Synapse, Azure Storage, PySpark, SQL, Python, and Power BI cloud migration. Delivered Azure-based ingestion, transformation, and reporting solutions for Standard Bank and Coca-Cola, including flat-file processing from Azure Storage in XML, Parquet, and CSV formats.</w:t>
       </w:r>
     </w:p>
     <w:p>
@@ -113,7 +108,10 @@
           <w:sz w:val="22"/>
         </w:rPr>
       </w:pPr>
-      <w:r>
+    </w:p>
+    <w:p>
+      <w:pPr>
+        <w:spacing w:before="200" w:after="40"/>
         <w:rPr>
           <w:rFonts w:ascii="Calibri" w:hAnsi="Calibri" w:cs="Calibri"/>
           <w:b/>
@@ -121,25 +119,110 @@
           <w:color w:val="1F3864"/>
           <w:sz w:val="22"/>
         </w:rPr>
-        <w:t>Professional Experience</w:t>
-      </w:r>
-    </w:p>
-    <w:p>
-      <w:pPr>
-        <w:spacing w:before="80" w:after="0"/>
-        <w:rPr>
-          <w:rFonts w:ascii="Calibri" w:hAnsi="Calibri" w:cs="Calibri"/>
-          <w:color w:val="404040"/>
-          <w:sz w:val="20"/>
-        </w:rPr>
-      </w:pPr>
-      <w:r>
-        <w:rPr>
-          <w:rFonts w:ascii="Calibri" w:hAnsi="Calibri" w:cs="Calibri"/>
-          <w:b/>
+      </w:pPr>
+      <w:r>
+        <w:rPr>
+          <w:rFonts w:ascii="Calibri" w:hAnsi="Calibri" w:cs="Calibri"/>
+          <w:b/>
+          <w:caps/>
           <w:color w:val="1F3864"/>
           <w:sz w:val="22"/>
         </w:rPr>
+        <w:t>Selected Azure Data Platform Projects</w:t>
+      </w:r>
+    </w:p>
+    <w:p>
+      <w:pPr>
+        <w:spacing w:before="200" w:after="40"/>
+        <w:rPr>
+          <w:rFonts w:ascii="Calibri" w:hAnsi="Calibri" w:cs="Calibri"/>
+          <w:b/>
+          <w:caps/>
+          <w:color w:val="1F3864"/>
+          <w:sz w:val="22"/>
+        </w:rPr>
+      </w:pPr>
+    </w:p>
+    <w:p>
+      <w:pPr>
+        <w:spacing w:before="200" w:after="40"/>
+        <w:rPr>
+          <w:rFonts w:ascii="Calibri" w:hAnsi="Calibri" w:cs="Calibri"/>
+          <w:b/>
+          <w:caps/>
+          <w:color w:val="1F3864"/>
+          <w:sz w:val="22"/>
+        </w:rPr>
+      </w:pPr>
+      <w:r>
+        <w:t>• Standard Bank: Led data migration from legacy sources into Azure, building cloud artefacts in Azure Data Factory, Azure Storage, and Azure Synapse; used Python and PySpark to transform data and configured Power BI Service workspaces, datasets, refresh schedules, gateway connections, and permissions for cloud reporting.</w:t>
+      </w:r>
+    </w:p>
+    <w:p>
+      <w:pPr>
+        <w:spacing w:before="200" w:after="40"/>
+        <w:rPr>
+          <w:rFonts w:ascii="Calibri" w:hAnsi="Calibri" w:cs="Calibri"/>
+          <w:b/>
+          <w:caps/>
+          <w:color w:val="1F3864"/>
+          <w:sz w:val="22"/>
+        </w:rPr>
+      </w:pPr>
+      <w:r>
+        <w:t>• Coca-Cola: Automated operational data pipelines with Azure Data Factory, Python, and PySpark, staging flat files from Azure Storage into Synapse and supporting Power BI reporting with cleaner, more consistent curated data.</w:t>
+      </w:r>
+    </w:p>
+    <w:p>
+      <w:pPr>
+        <w:spacing w:before="200" w:after="40"/>
+        <w:rPr>
+          <w:rFonts w:ascii="Calibri" w:hAnsi="Calibri" w:cs="Calibri"/>
+          <w:b/>
+          <w:caps/>
+          <w:color w:val="1F3864"/>
+          <w:sz w:val="22"/>
+        </w:rPr>
+      </w:pPr>
+    </w:p>
+    <w:p>
+      <w:pPr>
+        <w:spacing w:before="200" w:after="40"/>
+        <w:rPr>
+          <w:rFonts w:ascii="Calibri" w:hAnsi="Calibri" w:cs="Calibri"/>
+          <w:b/>
+          <w:caps/>
+          <w:color w:val="1F3864"/>
+          <w:sz w:val="22"/>
+        </w:rPr>
+      </w:pPr>
+      <w:r>
+        <w:rPr>
+          <w:rFonts w:ascii="Calibri" w:hAnsi="Calibri" w:cs="Calibri"/>
+          <w:b/>
+          <w:caps/>
+          <w:color w:val="1F3864"/>
+          <w:sz w:val="22"/>
+        </w:rPr>
+        <w:t>Professional Experience</w:t>
+      </w:r>
+    </w:p>
+    <w:p>
+      <w:pPr>
+        <w:spacing w:before="80" w:after="0"/>
+        <w:rPr>
+          <w:rFonts w:ascii="Calibri" w:hAnsi="Calibri" w:cs="Calibri"/>
+          <w:color w:val="404040"/>
+          <w:sz w:val="20"/>
+        </w:rPr>
+      </w:pPr>
+      <w:r>
+        <w:rPr>
+          <w:rFonts w:ascii="Calibri" w:hAnsi="Calibri" w:cs="Calibri"/>
+          <w:b/>
+          <w:color w:val="1F3864"/>
+          <w:sz w:val="22"/>
+        </w:rPr>
         <w:t>Sambe Consulting</w:t>
       </w:r>
       <w:r>
@@ -569,6 +652,7 @@
           <w:color w:val="000000"/>
           <w:sz w:val="20"/>
         </w:rPr>
+        <w:lastRenderedPageBreak/>
         <w:t>•  Implemented data quality checks and reconciliation queries to ensure staging-to-DW integrity across every monthly ETL cycle.</w:t>
       </w:r>
     </w:p>

</xml_diff>